<commit_message>
Atualiza cronograma da R1 e distribuicao das atividades
</commit_message>
<xml_diff>
--- a/docs/07_Roteiro_Discussao_R1.docx
+++ b/docs/07_Roteiro_Discussao_R1.docx
@@ -22,7 +22,7 @@
     </w:p>
     <w:p>
       <w:r>
-        <w:t>Versão 1.0 | 27/10/2026</w:t>
+        <w:t>Versão 1.1 | 28/10/2026</w:t>
       </w:r>
     </w:p>
     <w:p>
@@ -89,11 +89,7 @@
     </w:p>
     <w:p>
       <w:r>
-        <w:t>No prompt, executar set MOSTRAR_NAVEGADOR=1 e depois scripts</w:t>
-      </w:r>
-      <w:r>
-        <w:tab/>
-        <w:t>estar.bat, para mostrar o Chrome sendo controlado. A suíte executa 37 cenários em menos de 20 segundos: 20 do CT01, 15 do CT02 e 2 antecipados do CT13.</w:t>
+        <w:t>No prompt, executar scripts\testar.bat. A revisão de 28/10 aprovou os 37 cenários: 20 CT01, 15 CT02 e 2 CT13. A duração depende do ambiente; consultar o relatório.</w:t>
       </w:r>
     </w:p>
     <w:p>
@@ -116,7 +112,7 @@
     </w:p>
     <w:p>
       <w:r>
-        <w:t>Mostrar as tags release-0 e release-1 como baselines e o arquivo docs/gerencia_configuracao.md com o fluxo de branches, revisões, tags e controle de mudanças.</w:t>
+        <w:t>Mostrar a tag release-0. O PR #17 foi integrado à main em 28/10 (1e1b6b8); a tag release-1 ainda precisa ser criada após integrar e revisar as correções.</w:t>
       </w:r>
     </w:p>
     <w:p>
@@ -129,12 +125,12 @@
     </w:p>
     <w:p>
       <w:r>
-        <w:t>Abrir 03_CRO_Cade_Meu_Trem.pod no ProjectLibre e o Gantt de acompanhamento. Comparar a linha de base com as datas reais: as atividades da R1 terminaram até 4 dias depois do previsto, acionando o limiar do risco R2. A recuperação ocorreu sem usar a reserva B01, e o marco de 29/10 foi mantido.</w:t>
+        <w:t>Abrir 03_CRO_Cade_Meu_Trem.pod v2.2. Mostrar a linha de base preservada (76 h) e o campo % físico concluído das subtarefas. As notas registram as evidências de 27 e 28/10; Start/Finish continuam como planejamento até receber os apontamentos reais.</w:t>
       </w:r>
     </w:p>
     <w:p>
       <w:r>
-        <w:t>Informar as horas reais registradas e encerrar com a R2, em 05/11: objetos, empréstimos e devolução.</w:t>
+        <w:t>Informar que os apontamentos reais ainda precisam ser transcritos por atividade e integrante. Não apresentar valores calculados automaticamente como medidos. Próxima entrega: R2, em 05/11.</w:t>
       </w:r>
     </w:p>
     <w:p>
@@ -181,13 +177,7 @@
     </w:p>
     <w:p>
       <w:r>
-        <w:rPr>
-          <w:b/>
-        </w:rPr>
-        <w:t xml:space="preserve">As horas do cronograma são reais?: </w:t>
-      </w:r>
-      <w:r>
-        <w:t>As datas e o progresso são reais. As horas são as informadas pela dupla; quando não houver medição, apresentá-las como estimadas.</w:t>
+        <w:t>As horas do cronograma são reais?: Não estão lançadas nesta revisão. As 76 h são planejadas; % físico registra entregas comprovadas. Esforço, início/fim reais e EVM dependem dos apontamentos da dupla.</w:t>
       </w:r>
     </w:p>
     <w:p>
@@ -225,13 +215,7 @@
     </w:p>
     <w:p>
       <w:r>
-        <w:rPr>
-          <w:b/>
-        </w:rPr>
-        <w:t xml:space="preserve">Como a dupla dividiu o trabalho?: </w:t>
-      </w:r>
-      <w:r>
-        <w:t>Felipe apresenta o DRE e a demonstração; Antony apresenta testes, GitHub e cronograma. Os dois revisaram o Pull Request.</w:t>
+        <w:t>Como a dupla dividiu o trabalho?: Divisão sugerida para a apresentação: Felipe mostra DRE e sistema; Antony mostra testes, GitHub e cronograma. Confirmar a divisão e a revisão de cada integrante antes da aula.</w:t>
       </w:r>
     </w:p>
     <w:p>
@@ -244,7 +228,7 @@
     </w:p>
     <w:p>
       <w:r>
-        <w:t>Deixar abertos o DRE em PDF, o sistema com dados de exemplo, o prompt na pasta do projeto, o GitHub, a MRB e o cronograma no ProjectLibre. Conferir se o Pull Request foi revisado, se a tag release-1 existe e se as horas reais foram registradas. Não apresentar como executado o que ainda não tiver evidência.</w:t>
+        <w:t>Deixar abertos DRE, sistema, testes, GitHub, MRB e cronograma. Conferir a revisão, a tag, os apontamentos e as pendências no Status Report. Não apresentar como concluído o que ainda não tiver evidência.</w:t>
       </w:r>
     </w:p>
     <w:sectPr>
@@ -294,7 +278,7 @@
       <w:rPr>
         <w:sz w:val="16"/>
       </w:rPr>
-      <w:t xml:space="preserve">Cadê Meu Trem? | v1.0 | </w:t>
+      <w:t xml:space="preserve">Cadê Meu Trem? | v1.1 | </w:t>
     </w:r>
     <w:r>
       <w:fldChar w:fldCharType="begin"/>

</xml_diff>

<commit_message>
Conclui revisao da Release 1 e atualiza cronograma e documentacao
</commit_message>
<xml_diff>
--- a/docs/07_Roteiro_Discussao_R1.docx
+++ b/docs/07_Roteiro_Discussao_R1.docx
@@ -22,7 +22,7 @@
     </w:p>
     <w:p>
       <w:r>
-        <w:t>Versão 1.0 | 27/10/2026</w:t>
+        <w:t>Versão 1.1 | 28/10/2026</w:t>
       </w:r>
     </w:p>
     <w:p>
@@ -89,11 +89,7 @@
     </w:p>
     <w:p>
       <w:r>
-        <w:t>No prompt, executar set MOSTRAR_NAVEGADOR=1 e depois scripts</w:t>
-      </w:r>
-      <w:r>
-        <w:tab/>
-        <w:t>estar.bat, para mostrar o Chrome sendo controlado. A suíte executa 37 cenários em menos de 20 segundos: 20 do CT01, 15 do CT02 e 2 antecipados do CT13.</w:t>
+        <w:t>No prompt, executar scripts\testar.bat. A revisão de 28/10 aprovou os 37 cenários: 20 CT01, 15 CT02 e 2 CT13. A duração depende do ambiente; consultar o relatório.</w:t>
       </w:r>
     </w:p>
     <w:p>
@@ -116,7 +112,7 @@
     </w:p>
     <w:p>
       <w:r>
-        <w:t>Mostrar as tags release-0 e release-1 como baselines e o arquivo docs/gerencia_configuracao.md com o fluxo de branches, revisões, tags e controle de mudanças.</w:t>
+        <w:t>Mostrar a tag release-0. O PR #17 foi integrado à main em 28/10 (1e1b6b8); a tag release-1 ainda precisa ser criada após integrar e revisar as correções.</w:t>
       </w:r>
     </w:p>
     <w:p>
@@ -129,12 +125,12 @@
     </w:p>
     <w:p>
       <w:r>
-        <w:t>Abrir 03_CRO_Cade_Meu_Trem.pod no ProjectLibre e o Gantt de acompanhamento. Comparar a linha de base com as datas reais: as atividades da R1 terminaram até 4 dias depois do previsto, acionando o limiar do risco R2. A recuperação ocorreu sem usar a reserva B01, e o marco de 29/10 foi mantido.</w:t>
+        <w:t>Abrir 03_CRO_Cade_Meu_Trem.pod v2.2. Mostrar a linha de base preservada (76 h) e o campo % físico concluído das subtarefas. As notas registram as evidências de 27 e 28/10; Start/Finish continuam como planejamento até receber os apontamentos reais.</w:t>
       </w:r>
     </w:p>
     <w:p>
       <w:r>
-        <w:t>Informar as horas reais registradas e encerrar com a R2, em 05/11: objetos, empréstimos e devolução.</w:t>
+        <w:t>Informar que os apontamentos reais ainda precisam ser transcritos por atividade e integrante. Não apresentar valores calculados automaticamente como medidos. Próxima entrega: R2, em 05/11.</w:t>
       </w:r>
     </w:p>
     <w:p>
@@ -181,13 +177,7 @@
     </w:p>
     <w:p>
       <w:r>
-        <w:rPr>
-          <w:b/>
-        </w:rPr>
-        <w:t xml:space="preserve">As horas do cronograma são reais?: </w:t>
-      </w:r>
-      <w:r>
-        <w:t>As datas e o progresso são reais. As horas são as informadas pela dupla; quando não houver medição, apresentá-las como estimadas.</w:t>
+        <w:t>As horas do cronograma são reais?: Não estão lançadas nesta revisão. As 76 h são planejadas; % físico registra entregas comprovadas. Esforço, início/fim reais e EVM dependem dos apontamentos da dupla.</w:t>
       </w:r>
     </w:p>
     <w:p>
@@ -225,13 +215,7 @@
     </w:p>
     <w:p>
       <w:r>
-        <w:rPr>
-          <w:b/>
-        </w:rPr>
-        <w:t xml:space="preserve">Como a dupla dividiu o trabalho?: </w:t>
-      </w:r>
-      <w:r>
-        <w:t>Felipe apresenta o DRE e a demonstração; Antony apresenta testes, GitHub e cronograma. Os dois revisaram o Pull Request.</w:t>
+        <w:t>Como a dupla dividiu o trabalho?: Divisão sugerida para a apresentação: Felipe mostra DRE e sistema; Antony mostra testes, GitHub e cronograma. Confirmar a divisão e a revisão de cada integrante antes da aula.</w:t>
       </w:r>
     </w:p>
     <w:p>
@@ -244,7 +228,7 @@
     </w:p>
     <w:p>
       <w:r>
-        <w:t>Deixar abertos o DRE em PDF, o sistema com dados de exemplo, o prompt na pasta do projeto, o GitHub, a MRB e o cronograma no ProjectLibre. Conferir se o Pull Request foi revisado, se a tag release-1 existe e se as horas reais foram registradas. Não apresentar como executado o que ainda não tiver evidência.</w:t>
+        <w:t>Deixar abertos DRE, sistema, testes, GitHub, MRB e cronograma. Conferir a revisão, a tag, os apontamentos e as pendências no Status Report. Não apresentar como concluído o que ainda não tiver evidência.</w:t>
       </w:r>
     </w:p>
     <w:sectPr>
@@ -294,7 +278,7 @@
       <w:rPr>
         <w:sz w:val="16"/>
       </w:rPr>
-      <w:t xml:space="preserve">Cadê Meu Trem? | v1.0 | </w:t>
+      <w:t xml:space="preserve">Cadê Meu Trem? | v1.1 | </w:t>
     </w:r>
     <w:r>
       <w:fldChar w:fldCharType="begin"/>

</xml_diff>